<commit_message>
Finalize submission tables supplement and algorithm asset
</commit_message>
<xml_diff>
--- a/submission_upload/01_Text_Only_Manuscript/Manuscript_Text_Only.docx
+++ b/submission_upload/01_Text_Only_Manuscript/Manuscript_Text_Only.docx
@@ -675,7 +675,9 @@
       </w:pPr>
       <w:r>
         <w:rPr>
+          <w:rFonts w:ascii="Times New Roman" w:hAnsi="Times New Roman"/>
           <w:b/>
+          <w:i w:val="0"/>
         </w:rPr>
         <w:t>[FIGURE 1: uploaded separately as Figure1_Methods.png]</w:t>
       </w:r>
@@ -1423,10 +1425,11 @@
       </w:pPr>
       <w:r>
         <w:rPr>
+          <w:rFonts w:ascii="Times New Roman" w:hAnsi="Times New Roman"/>
           <w:b/>
-          <w:bCs/>
-        </w:rPr>
-        <w:t xml:space="preserve">[ALGORITHM 1: </w:t>
+          <w:i w:val="0"/>
+        </w:rPr>
+        <w:t>[ALGORITHM 1: uploaded separately as Algorithm1_Bilateral_ZUPT.png]</w:t>
       </w:r>
     </w:p>
     <w:p>
@@ -1437,10 +1440,11 @@
       </w:pPr>
       <w:r>
         <w:rPr>
-          <w:b/>
-          <w:bCs/>
-        </w:rPr>
-        <w:t>placeholder. Bilateral ZUPT stride-length estimation pseudocode]</w:t>
+          <w:rFonts w:ascii="Times New Roman" w:hAnsi="Times New Roman"/>
+          <w:b w:val="0"/>
+          <w:i/>
+        </w:rPr>
+        <w:t>Algorithm 1. Bilateral ZUPT stride-length estimation.</w:t>
       </w:r>
     </w:p>
     <w:p>
@@ -1721,25 +1725,11 @@
       </w:pPr>
       <w:r>
         <w:rPr>
+          <w:rFonts w:ascii="Times New Roman" w:hAnsi="Times New Roman"/>
           <w:b/>
-          <w:bCs/>
-        </w:rPr>
-        <w:t xml:space="preserve">[TABLE 1: placeholder. Label: </w:t>
-      </w:r>
-      <w:r>
-        <w:rPr>
-          <w:rStyle w:val="VerbatimChar"/>
-          <w:b/>
-          <w:bCs/>
-        </w:rPr>
-        <w:t>tab:events</w:t>
-      </w:r>
-      <w:r>
-        <w:rPr>
-          <w:b/>
-          <w:bCs/>
-        </w:rPr>
-        <w:t>]</w:t>
+          <w:i w:val="0"/>
+        </w:rPr>
+        <w:t>[TABLE 1: uploaded separately as Table1_Gait_Event_Accuracy.docx]</w:t>
       </w:r>
     </w:p>
     <w:p>
@@ -1754,10 +1744,11 @@
       </w:pPr>
       <w:r>
         <w:rPr>
+          <w:rFonts w:ascii="Times New Roman" w:hAnsi="Times New Roman"/>
+          <w:b w:val="0"/>
           <w:i/>
-          <w:iCs/>
-        </w:rPr>
-        <w:t>Caption: Adaptive-threshold gait-event accuracy. HS = heel strike; TO = toe off. Miss rate is the percentage of GaitRite events unmatched within 150 ms. Bias = mean IMU-minus-GaitRite timing error.</w:t>
+        </w:rPr>
+        <w:t>Table 1. Adaptive-threshold gait-event accuracy. HS = heel strike; TO = toe off. Miss rate is the percentage of GaitRite events unmatched within 150 ms. Bias = mean IMU-minus-GaitRite timing error.</w:t>
       </w:r>
     </w:p>
     <w:p>
@@ -1825,26 +1816,11 @@
       </w:pPr>
       <w:r>
         <w:rPr>
+          <w:rFonts w:ascii="Times New Roman" w:hAnsi="Times New Roman"/>
           <w:b/>
-          <w:bCs/>
-        </w:rPr>
-        <w:lastRenderedPageBreak/>
-        <w:t xml:space="preserve">[TABLE 2: placeholder. Label: </w:t>
-      </w:r>
-      <w:r>
-        <w:rPr>
-          <w:rStyle w:val="VerbatimChar"/>
-          <w:b/>
-          <w:bCs/>
-        </w:rPr>
-        <w:t>tab:design</w:t>
-      </w:r>
-      <w:r>
-        <w:rPr>
-          <w:b/>
-          <w:bCs/>
-        </w:rPr>
-        <w:t>]</w:t>
+          <w:i w:val="0"/>
+        </w:rPr>
+        <w:t>[TABLE 2: uploaded separately as Table2_Pipeline_Design_Comparisons.docx]</w:t>
       </w:r>
     </w:p>
     <w:p>
@@ -1859,25 +1835,11 @@
       </w:pPr>
       <w:r>
         <w:rPr>
+          <w:rFonts w:ascii="Times New Roman" w:hAnsi="Times New Roman"/>
+          <w:b w:val="0"/>
           <w:i/>
-          <w:iCs/>
-        </w:rPr>
-        <w:t xml:space="preserve">Caption: Pipeline design comparisons. The blocks compare stance detection and integration anchors on their respective shared stride sets, so </w:t>
-      </w:r>
-      <m:oMath>
-        <m:r>
-          <w:rPr>
-            <w:rFonts w:ascii="Cambria Math" w:hAnsi="Cambria Math"/>
-          </w:rPr>
-          <m:t>N</m:t>
-        </m:r>
-      </m:oMath>
-      <w:r>
-        <w:rPr>
-          <w:i/>
-          <w:iCs/>
-        </w:rPr>
-        <w:t xml:space="preserve"> differs. All other pipeline steps were held constant. Bias = IMU minus GaitRite.</w:t>
+        </w:rPr>
+        <w:t>Table 2. Pipeline design comparisons. The blocks compare stance detection and integration anchors on their respective shared stride sets, so N differs. All other pipeline steps were held constant. Bias = IMU minus GaitRite.</w:t>
       </w:r>
     </w:p>
     <w:p>
@@ -2039,25 +2001,11 @@
       </w:pPr>
       <w:r>
         <w:rPr>
+          <w:rFonts w:ascii="Times New Roman" w:hAnsi="Times New Roman"/>
           <w:b/>
-          <w:bCs/>
-        </w:rPr>
-        <w:t xml:space="preserve">[TABLE 3: placeholder. Label: </w:t>
-      </w:r>
-      <w:r>
-        <w:rPr>
-          <w:rStyle w:val="VerbatimChar"/>
-          <w:b/>
-          <w:bCs/>
-        </w:rPr>
-        <w:t>tab:accuracy</w:t>
-      </w:r>
-      <w:r>
-        <w:rPr>
-          <w:b/>
-          <w:bCs/>
-        </w:rPr>
-        <w:t>]</w:t>
+          <w:i w:val="0"/>
+        </w:rPr>
+        <w:t>[TABLE 3: uploaded separately as Table3_Stride_Length_Accuracy.docx]</w:t>
       </w:r>
     </w:p>
     <w:p>
@@ -2068,40 +2016,11 @@
       </w:pPr>
       <w:r>
         <w:rPr>
+          <w:rFonts w:ascii="Times New Roman" w:hAnsi="Times New Roman"/>
+          <w:b w:val="0"/>
           <w:i/>
-          <w:iCs/>
-        </w:rPr>
-        <w:t xml:space="preserve">Caption: Bilateral ZUPT stride-length accuracy by condition. </w:t>
-      </w:r>
-      <m:oMath>
-        <m:r>
-          <w:rPr>
-            <w:rFonts w:ascii="Cambria Math" w:hAnsi="Cambria Math"/>
-          </w:rPr>
-          <m:t>n</m:t>
-        </m:r>
-      </m:oMath>
-      <w:r>
-        <w:rPr>
-          <w:i/>
-          <w:iCs/>
-        </w:rPr>
-        <w:t xml:space="preserve"> = participants; </w:t>
-      </w:r>
-      <m:oMath>
-        <m:r>
-          <w:rPr>
-            <w:rFonts w:ascii="Cambria Math" w:hAnsi="Cambria Math"/>
-          </w:rPr>
-          <m:t>N</m:t>
-        </m:r>
-      </m:oMath>
-      <w:r>
-        <w:rPr>
-          <w:i/>
-          <w:iCs/>
-        </w:rPr>
-        <w:t xml:space="preserve"> = matched stride pairs; bias = mean IMU-minus-GaitRite error; LoA = Bland–Altman 95% limits of agreement.</w:t>
+        </w:rPr>
+        <w:t>Table 3. Bilateral ZUPT stride-length accuracy by condition. n = participants; N = matched stride pairs; bias = mean IMU-minus-GaitRite error; LoA = Bland–Altman 95% limits of agreement.</w:t>
       </w:r>
     </w:p>
     <w:p>
@@ -2123,25 +2042,11 @@
       </w:pPr>
       <w:r>
         <w:rPr>
+          <w:rFonts w:ascii="Times New Roman" w:hAnsi="Times New Roman"/>
           <w:b/>
-          <w:bCs/>
-        </w:rPr>
-        <w:t xml:space="preserve">[FIGURE 2: placeholder. Label: </w:t>
-      </w:r>
-      <w:r>
-        <w:rPr>
-          <w:rStyle w:val="VerbatimChar"/>
-          <w:b/>
-          <w:bCs/>
-        </w:rPr>
-        <w:t>fig:scatter</w:t>
-      </w:r>
-      <w:r>
-        <w:rPr>
-          <w:b/>
-          <w:bCs/>
-        </w:rPr>
-        <w:t>]</w:t>
+          <w:i w:val="0"/>
+        </w:rPr>
+        <w:t>[FIGURE 2: uploaded separately as Figure2_Agreement.pdf]</w:t>
       </w:r>
     </w:p>
     <w:p>
@@ -2155,59 +2060,11 @@
       </w:pPr>
       <w:r>
         <w:rPr>
+          <w:rFonts w:ascii="Times New Roman" w:hAnsi="Times New Roman"/>
+          <w:b w:val="0"/>
           <w:i/>
-          <w:iCs/>
-        </w:rPr>
-        <w:t xml:space="preserve">Caption: Stride length agreement between IMU and GaitRite. (a) All 10,472 matched strides. The dashed line marks identity, and the contour encloses the densest 97.5% of points. Linear fit </w:t>
-      </w:r>
-      <m:oMath>
-        <m:sSup>
-          <m:sSupPr>
-            <m:ctrlPr>
-              <w:rPr>
-                <w:rFonts w:ascii="Cambria Math" w:hAnsi="Cambria Math"/>
-              </w:rPr>
-            </m:ctrlPr>
-          </m:sSupPr>
-          <m:e>
-            <m:r>
-              <w:rPr>
-                <w:rFonts w:ascii="Cambria Math" w:hAnsi="Cambria Math"/>
-              </w:rPr>
-              <m:t>R</m:t>
-            </m:r>
-          </m:e>
-          <m:sup>
-            <m:r>
-              <w:rPr>
-                <w:rFonts w:ascii="Cambria Math" w:hAnsi="Cambria Math"/>
-              </w:rPr>
-              <m:t>2</m:t>
-            </m:r>
-          </m:sup>
-        </m:sSup>
-        <m:r>
-          <m:rPr>
-            <m:sty m:val="p"/>
-          </m:rPr>
-          <w:rPr>
-            <w:rFonts w:ascii="Cambria Math" w:hAnsi="Cambria Math"/>
-          </w:rPr>
-          <m:t>=</m:t>
-        </m:r>
-        <m:r>
-          <w:rPr>
-            <w:rFonts w:ascii="Cambria Math" w:hAnsi="Cambria Math"/>
-          </w:rPr>
-          <m:t>0.954</m:t>
-        </m:r>
-      </m:oMath>
-      <w:r>
-        <w:rPr>
-          <w:i/>
-          <w:iCs/>
-        </w:rPr>
-        <w:t>, slope = 1.012, and ICC(2,1) = 0.976. (b) Bland–Altman plot. The red line marks mean bias (+0.003 m), dashed lines mark the 95% limits of agreement (-0.073 to +0.078 m), and the dotted line shows proportional bias (slope = 0.036).</w:t>
+        </w:rPr>
+        <w:t>Figure 2. Stride length agreement between IMU and GaitRite. (a) All 10,472 matched strides. The dashed line marks identity, and the contour encloses the densest 97.5% of points. Linear fit R² = 0.954, slope = 1.012, and ICC(2,1) = 0.976. (b) Bland–Altman plot. The red line marks mean bias (+0.003 m), dashed lines mark the 95% limits of agreement (−0.073 to +0.078 m), and the dotted line shows proportional bias (slope = 0.036).</w:t>
       </w:r>
     </w:p>
     <w:p>
@@ -2223,25 +2080,11 @@
       </w:pPr>
       <w:r>
         <w:rPr>
+          <w:rFonts w:ascii="Times New Roman" w:hAnsi="Times New Roman"/>
           <w:b/>
-          <w:bCs/>
-        </w:rPr>
-        <w:t xml:space="preserve">[FIGURE 3: placeholder. Label: </w:t>
-      </w:r>
-      <w:r>
-        <w:rPr>
-          <w:rStyle w:val="VerbatimChar"/>
-          <w:b/>
-          <w:bCs/>
-        </w:rPr>
-        <w:t>fig:subject_accuracy</w:t>
-      </w:r>
-      <w:r>
-        <w:rPr>
-          <w:b/>
-          <w:bCs/>
-        </w:rPr>
-        <w:t>]</w:t>
+          <w:i w:val="0"/>
+        </w:rPr>
+        <w:t>[FIGURE 3: uploaded separately as Figure3_Subject_Accuracy.pdf]</w:t>
       </w:r>
     </w:p>
     <w:p>
@@ -2255,40 +2098,11 @@
       </w:pPr>
       <w:r>
         <w:rPr>
+          <w:rFonts w:ascii="Times New Roman" w:hAnsi="Times New Roman"/>
+          <w:b w:val="0"/>
           <w:i/>
-          <w:iCs/>
-        </w:rPr>
-        <w:t>Caption: Participant stride-length accuracy across conditions (</w:t>
-      </w:r>
-      <m:oMath>
-        <m:r>
-          <w:rPr>
-            <w:rFonts w:ascii="Cambria Math" w:hAnsi="Cambria Math"/>
-          </w:rPr>
-          <m:t>n</m:t>
-        </m:r>
-        <m:r>
-          <m:rPr>
-            <m:sty m:val="p"/>
-          </m:rPr>
-          <w:rPr>
-            <w:rFonts w:ascii="Cambria Math" w:hAnsi="Cambria Math"/>
-          </w:rPr>
-          <m:t>=</m:t>
-        </m:r>
-        <m:r>
-          <w:rPr>
-            <w:rFonts w:ascii="Cambria Math" w:hAnsi="Cambria Math"/>
-          </w:rPr>
-          <m:t>32</m:t>
-        </m:r>
-      </m:oMath>
-      <w:r>
-        <w:rPr>
-          <w:i/>
-          <w:iCs/>
-        </w:rPr>
-        <w:t>). Dots show participants sorted by MAE with 95% CIs. The solid red and dashed grey lines mark the mean (2.5 cm) and median (2.4 cm), respectively.</w:t>
+        </w:rPr>
+        <w:t>Figure 3. Participant stride-length accuracy across conditions (n = 32). Dots show participants sorted by MAE with 95% CIs. The solid red and dashed grey lines mark the mean (2.5 cm) and median (2.4 cm), respectively.</w:t>
       </w:r>
     </w:p>
     <w:p>
@@ -2870,25 +2684,11 @@
       </w:pPr>
       <w:r>
         <w:rPr>
+          <w:rFonts w:ascii="Times New Roman" w:hAnsi="Times New Roman"/>
           <w:b/>
-          <w:bCs/>
-        </w:rPr>
-        <w:t xml:space="preserve">[TABLE 4: placeholder. Label: </w:t>
-      </w:r>
-      <w:r>
-        <w:rPr>
-          <w:rStyle w:val="VerbatimChar"/>
-          <w:b/>
-          <w:bCs/>
-        </w:rPr>
-        <w:t>tab:spatiotemporal</w:t>
-      </w:r>
-      <w:r>
-        <w:rPr>
-          <w:b/>
-          <w:bCs/>
-        </w:rPr>
-        <w:t>]</w:t>
+          <w:i w:val="0"/>
+        </w:rPr>
+        <w:t>[TABLE 4: uploaded separately as Table4_Spatiotemporal_Agreement.docx]</w:t>
       </w:r>
     </w:p>
     <w:p>
@@ -2903,10 +2703,11 @@
       </w:pPr>
       <w:r>
         <w:rPr>
+          <w:rFonts w:ascii="Times New Roman" w:hAnsi="Times New Roman"/>
+          <w:b w:val="0"/>
           <w:i/>
-          <w:iCs/>
-        </w:rPr>
-        <w:t>Caption: Spatiotemporal agreement by condition across 10,472 matched strides. GaitRite and IMU values are mean (SD), and bias = IMU minus GaitRite. Stride-length CV is calculated within participant and reported as the cohort mean.</w:t>
+        </w:rPr>
+        <w:t>Table 4. Spatiotemporal agreement by condition across 10,472 matched strides. GaitRite and IMU values are mean (SD), and bias = IMU minus GaitRite. Stride-length CV is calculated within participant and reported as the cohort mean.</w:t>
       </w:r>
     </w:p>
     <w:p>

</xml_diff>